<commit_message>
fix: update module name length and enhance semester registration document formatting
</commit_message>
<xml_diff>
--- a/frontend/public/semester-registration.docx
+++ b/frontend/public/semester-registration.docx
@@ -579,7 +579,6 @@
         </w:rPr>
         <w:t xml:space="preserve">ostal </w:t>
       </w:r>
-      <w:proofErr w:type="gramStart"/>
       <w:r>
         <w:rPr>
           <w:rFonts w:ascii="Times New Roman" w:hAnsi="Times New Roman" w:cs="Times New Roman"/>
@@ -593,7 +592,6 @@
         </w:rPr>
         <w:t>.</w:t>
       </w:r>
-      <w:proofErr w:type="gramEnd"/>
     </w:p>
     <w:p>
       <w:pPr>
@@ -714,25 +712,7 @@
           <w:sz w:val="20"/>
           <w:szCs w:val="20"/>
         </w:rPr>
-        <w:t xml:space="preserve">Please </w:t>
-      </w:r>
-      <w:proofErr w:type="gramStart"/>
-      <w:r>
-        <w:rPr>
-          <w:rFonts w:ascii="Times New Roman" w:hAnsi="Times New Roman" w:cs="Times New Roman"/>
-          <w:sz w:val="20"/>
-          <w:szCs w:val="20"/>
-        </w:rPr>
-        <w:t>fill</w:t>
-      </w:r>
-      <w:proofErr w:type="gramEnd"/>
-      <w:r>
-        <w:rPr>
-          <w:rFonts w:ascii="Times New Roman" w:hAnsi="Times New Roman" w:cs="Times New Roman"/>
-          <w:sz w:val="20"/>
-          <w:szCs w:val="20"/>
-        </w:rPr>
-        <w:t xml:space="preserve"> the following columns indicating the subjects which you follow </w:t>
+        <w:t xml:space="preserve">Please fill the following columns indicating the subjects which you follow </w:t>
       </w:r>
       <w:r>
         <w:rPr>
@@ -1911,164 +1891,6 @@
           </w:p>
         </w:tc>
       </w:tr>
-      <w:tr>
-        <w:trPr>
-          <w:trHeight w:val="360"/>
-        </w:trPr>
-        <w:tc>
-          <w:tcPr>
-            <w:tcW w:w="630" w:type="dxa"/>
-            <w:vAlign w:val="center"/>
-          </w:tcPr>
-          <w:p>
-            <w:pPr>
-              <w:widowControl w:val="0"/>
-              <w:jc w:val="center"/>
-              <w:rPr>
-                <w:rFonts w:ascii="Times New Roman" w:hAnsi="Times New Roman" w:cs="Times New Roman"/>
-                <w:bCs/>
-                <w:sz w:val="24"/>
-                <w:szCs w:val="24"/>
-              </w:rPr>
-            </w:pPr>
-            <w:r>
-              <w:rPr>
-                <w:rFonts w:ascii="Times New Roman" w:hAnsi="Times New Roman" w:cs="Times New Roman"/>
-                <w:bCs/>
-                <w:sz w:val="24"/>
-                <w:szCs w:val="24"/>
-              </w:rPr>
-              <w:t>13</w:t>
-            </w:r>
-            <w:r>
-              <w:rPr>
-                <w:rFonts w:ascii="Times New Roman" w:hAnsi="Times New Roman" w:cs="Times New Roman"/>
-                <w:bCs/>
-                <w:sz w:val="24"/>
-                <w:szCs w:val="24"/>
-              </w:rPr>
-              <w:t>.</w:t>
-            </w:r>
-          </w:p>
-        </w:tc>
-        <w:tc>
-          <w:tcPr>
-            <w:tcW w:w="7920" w:type="dxa"/>
-            <w:vAlign w:val="center"/>
-          </w:tcPr>
-          <w:p>
-            <w:pPr>
-              <w:widowControl w:val="0"/>
-              <w:jc w:val="center"/>
-              <w:rPr>
-                <w:rFonts w:ascii="Times New Roman" w:hAnsi="Times New Roman" w:cs="Times New Roman"/>
-                <w:b/>
-                <w:bCs/>
-                <w:sz w:val="24"/>
-                <w:szCs w:val="24"/>
-              </w:rPr>
-            </w:pPr>
-          </w:p>
-        </w:tc>
-        <w:tc>
-          <w:tcPr>
-            <w:tcW w:w="1890" w:type="dxa"/>
-            <w:vAlign w:val="center"/>
-          </w:tcPr>
-          <w:p>
-            <w:pPr>
-              <w:widowControl w:val="0"/>
-              <w:jc w:val="center"/>
-              <w:rPr>
-                <w:rFonts w:ascii="Times New Roman" w:hAnsi="Times New Roman" w:cs="Times New Roman"/>
-                <w:b/>
-                <w:bCs/>
-                <w:sz w:val="24"/>
-                <w:szCs w:val="24"/>
-              </w:rPr>
-            </w:pPr>
-          </w:p>
-        </w:tc>
-      </w:tr>
-      <w:tr>
-        <w:trPr>
-          <w:trHeight w:val="360"/>
-        </w:trPr>
-        <w:tc>
-          <w:tcPr>
-            <w:tcW w:w="630" w:type="dxa"/>
-            <w:vAlign w:val="center"/>
-          </w:tcPr>
-          <w:p>
-            <w:pPr>
-              <w:widowControl w:val="0"/>
-              <w:jc w:val="center"/>
-              <w:rPr>
-                <w:rFonts w:ascii="Times New Roman" w:hAnsi="Times New Roman" w:cs="Times New Roman"/>
-                <w:bCs/>
-                <w:sz w:val="24"/>
-                <w:szCs w:val="24"/>
-              </w:rPr>
-            </w:pPr>
-            <w:r>
-              <w:rPr>
-                <w:rFonts w:ascii="Times New Roman" w:hAnsi="Times New Roman" w:cs="Times New Roman"/>
-                <w:bCs/>
-                <w:sz w:val="24"/>
-                <w:szCs w:val="24"/>
-              </w:rPr>
-              <w:t>14</w:t>
-            </w:r>
-            <w:r>
-              <w:rPr>
-                <w:rFonts w:ascii="Times New Roman" w:hAnsi="Times New Roman" w:cs="Times New Roman"/>
-                <w:bCs/>
-                <w:sz w:val="24"/>
-                <w:szCs w:val="24"/>
-              </w:rPr>
-              <w:t>.</w:t>
-            </w:r>
-          </w:p>
-        </w:tc>
-        <w:tc>
-          <w:tcPr>
-            <w:tcW w:w="7920" w:type="dxa"/>
-            <w:vAlign w:val="center"/>
-          </w:tcPr>
-          <w:p>
-            <w:pPr>
-              <w:widowControl w:val="0"/>
-              <w:jc w:val="center"/>
-              <w:rPr>
-                <w:rFonts w:ascii="Times New Roman" w:hAnsi="Times New Roman" w:cs="Times New Roman"/>
-                <w:b/>
-                <w:bCs/>
-                <w:sz w:val="24"/>
-                <w:szCs w:val="24"/>
-              </w:rPr>
-            </w:pPr>
-          </w:p>
-        </w:tc>
-        <w:tc>
-          <w:tcPr>
-            <w:tcW w:w="1890" w:type="dxa"/>
-            <w:vAlign w:val="center"/>
-          </w:tcPr>
-          <w:p>
-            <w:pPr>
-              <w:widowControl w:val="0"/>
-              <w:jc w:val="center"/>
-              <w:rPr>
-                <w:rFonts w:ascii="Times New Roman" w:hAnsi="Times New Roman" w:cs="Times New Roman"/>
-                <w:b/>
-                <w:bCs/>
-                <w:sz w:val="24"/>
-                <w:szCs w:val="24"/>
-              </w:rPr>
-            </w:pPr>
-          </w:p>
-        </w:tc>
-      </w:tr>
     </w:tbl>
     <w:p>
       <w:pPr>
@@ -2694,14 +2516,7 @@
         <w:rPr>
           <w:rFonts w:ascii="Times New Roman" w:hAnsi="Times New Roman" w:cs="Times New Roman"/>
         </w:rPr>
-        <w:t xml:space="preserve">         </w:t>
-      </w:r>
-      <w:proofErr w:type="gramStart"/>
-      <w:r>
-        <w:rPr>
-          <w:rFonts w:ascii="Times New Roman" w:hAnsi="Times New Roman" w:cs="Times New Roman"/>
-        </w:rPr>
-        <w:t xml:space="preserve">  </w:t>
+        <w:t xml:space="preserve">           </w:t>
       </w:r>
       <w:r>
         <w:rPr>
@@ -2712,7 +2527,6 @@
         </w:rPr>
         <w:t>.</w:t>
       </w:r>
-      <w:proofErr w:type="gramEnd"/>
       <w:r>
         <w:rPr>
           <w:rFonts w:ascii="Times New Roman" w:hAnsi="Times New Roman" w:cs="Times New Roman"/>
@@ -2742,14 +2556,7 @@
         <w:rPr>
           <w:rFonts w:ascii="Times New Roman" w:hAnsi="Times New Roman" w:cs="Times New Roman"/>
         </w:rPr>
-        <w:t>Scholarship</w:t>
-      </w:r>
-      <w:proofErr w:type="gramStart"/>
-      <w:r>
-        <w:rPr>
-          <w:rFonts w:ascii="Times New Roman" w:hAnsi="Times New Roman" w:cs="Times New Roman"/>
-        </w:rPr>
-        <w:t>:</w:t>
+        <w:t>Scholarship:</w:t>
       </w:r>
       <w:r>
         <w:rPr>
@@ -2764,7 +2571,6 @@
         <w:t>(</w:t>
       </w:r>
       <w:proofErr w:type="spellStart"/>
-      <w:proofErr w:type="gramEnd"/>
       <w:r>
         <w:rPr>
           <w:rFonts w:ascii="Times New Roman" w:hAnsi="Times New Roman" w:cs="Times New Roman"/>
@@ -2839,16 +2645,8 @@
         <w:rPr>
           <w:rFonts w:ascii="Times New Roman" w:hAnsi="Times New Roman" w:cs="Times New Roman"/>
         </w:rPr>
-        <w:t>(</w:t>
-      </w:r>
-      <w:proofErr w:type="gramStart"/>
-      <w:r>
-        <w:rPr>
-          <w:rFonts w:ascii="Times New Roman" w:hAnsi="Times New Roman" w:cs="Times New Roman"/>
-        </w:rPr>
-        <w:t>ii</w:t>
-      </w:r>
-      <w:proofErr w:type="gramEnd"/>
+        <w:t>(ii</w:t>
+      </w:r>
       <w:r>
         <w:rPr>
           <w:rFonts w:ascii="Times New Roman" w:hAnsi="Times New Roman" w:cs="Times New Roman"/>
@@ -3049,25 +2847,24 @@
           <w:sz w:val="24"/>
           <w:szCs w:val="24"/>
         </w:rPr>
-        <w:t>Date</w:t>
-      </w:r>
-      <w:proofErr w:type="gramStart"/>
+        <w:t xml:space="preserve">Date: </w:t>
+      </w:r>
       <w:r>
         <w:rPr>
           <w:rFonts w:ascii="Times New Roman" w:hAnsi="Times New Roman" w:cs="Times New Roman"/>
           <w:sz w:val="24"/>
           <w:szCs w:val="24"/>
-        </w:rPr>
-        <w:t xml:space="preserve">: </w:t>
+          <w:u w:val="single"/>
+        </w:rPr>
+        <w:t xml:space="preserve">                               </w:t>
       </w:r>
       <w:r>
         <w:rPr>
           <w:rFonts w:ascii="Times New Roman" w:hAnsi="Times New Roman" w:cs="Times New Roman"/>
           <w:sz w:val="24"/>
           <w:szCs w:val="24"/>
-          <w:u w:val="single"/>
-        </w:rPr>
-        <w:t xml:space="preserve">                               </w:t>
+        </w:rPr>
+        <w:tab/>
       </w:r>
       <w:r>
         <w:rPr>
@@ -3075,24 +2872,7 @@
           <w:sz w:val="24"/>
           <w:szCs w:val="24"/>
         </w:rPr>
-        <w:tab/>
-      </w:r>
-      <w:r>
-        <w:rPr>
-          <w:rFonts w:ascii="Times New Roman" w:hAnsi="Times New Roman" w:cs="Times New Roman"/>
-          <w:sz w:val="24"/>
-          <w:szCs w:val="24"/>
-        </w:rPr>
-        <w:t>_</w:t>
-      </w:r>
-      <w:proofErr w:type="gramEnd"/>
-      <w:r>
-        <w:rPr>
-          <w:rFonts w:ascii="Times New Roman" w:hAnsi="Times New Roman" w:cs="Times New Roman"/>
-          <w:sz w:val="24"/>
-          <w:szCs w:val="24"/>
-        </w:rPr>
-        <w:t>____________________</w:t>
+        <w:t>_____________________</w:t>
       </w:r>
       <w:r>
         <w:rPr>

</xml_diff>